<commit_message>
fix: atualizar template DOCX e cobertura completa de placeholders
Template padrao atualizado e mapeamento de variaveis ampliado para 69 placeholders
</commit_message>
<xml_diff>
--- a/app/energia_solar/templates_word/proposta_solar_modelo.docx
+++ b/app/energia_solar/templates_word/proposta_solar_modelo.docx
@@ -7205,6 +7205,151 @@
         <w:t>• CPF/CNPJ: {{CPF_CNPJ_CLIENTE}}</w:t>
       </w:r>
     </w:p>
+    <w:p>
+      <w:r>
+        <w:br w:type="page"/>
+      </w:r>
+    </w:p>
+    <w:p>
+      <w:r>
+        <w:t>ANEXO - PLACEHOLDERS DISPONIVEIS</w:t>
+      </w:r>
+    </w:p>
+    <w:p>
+      <w:r>
+        <w:t>Atualizado em: 23/05/2026 15:46</w:t>
+      </w:r>
+    </w:p>
+    <w:p>
+      <w:r>
+        <w:t>Use exatamente com chaves duplas.</w:t>
+      </w:r>
+    </w:p>
+    <w:p>
+      <w:r>
+        <w:t>{{cliente_cpf_cnpj}}</w:t>
+      </w:r>
+    </w:p>
+    <w:p>
+      <w:r>
+        <w:t>{{cliente_nome}}</w:t>
+      </w:r>
+    </w:p>
+    <w:p>
+      <w:r>
+        <w:t>{{fatura_media_mensal_sem_sistema}}</w:t>
+      </w:r>
+    </w:p>
+    <w:p>
+      <w:r>
+        <w:t>{{fatura_minima}}</w:t>
+      </w:r>
+    </w:p>
+    <w:p>
+      <w:r>
+        <w:t>{{grafico_consumo_geracao_12_meses}}</w:t>
+      </w:r>
+    </w:p>
+    <w:p>
+      <w:r>
+        <w:t>{{grafico_consumo_geracao_25_anos}}</w:t>
+      </w:r>
+    </w:p>
+    <w:p>
+      <w:r>
+        <w:t>{{grafico_pay_back}}</w:t>
+      </w:r>
+    </w:p>
+    <w:p>
+      <w:r>
+        <w:t>{{id_projeto}}</w:t>
+      </w:r>
+    </w:p>
+    <w:p>
+      <w:r>
+        <w:t>{{inversor_fabricante}}</w:t>
+      </w:r>
+    </w:p>
+    <w:p>
+      <w:r>
+        <w:t>{{inversor_modelo}}</w:t>
+      </w:r>
+    </w:p>
+    <w:p>
+      <w:r>
+        <w:t>{{inversor_potencia}}</w:t>
+      </w:r>
+    </w:p>
+    <w:p>
+      <w:r>
+        <w:t>{{kit_descricao}}</w:t>
+      </w:r>
+    </w:p>
+    <w:p>
+      <w:r>
+        <w:t>{{kit_outras_inf}}</w:t>
+      </w:r>
+    </w:p>
+    <w:p>
+      <w:r>
+        <w:t>{{orcamento_valor_nota}}</w:t>
+      </w:r>
+    </w:p>
+    <w:p>
+      <w:r>
+        <w:t>{{payback_ano_lei_14300}}</w:t>
+      </w:r>
+    </w:p>
+    <w:p>
+      <w:r>
+        <w:t>{{payback_roi_lei_14300}}</w:t>
+      </w:r>
+    </w:p>
+    <w:p>
+      <w:r>
+        <w:t>{{placa_fabricante}}</w:t>
+      </w:r>
+    </w:p>
+    <w:p>
+      <w:r>
+        <w:t>{{placa_modelo}}</w:t>
+      </w:r>
+    </w:p>
+    <w:p>
+      <w:r>
+        <w:t>{{placa_potencia}}</w:t>
+      </w:r>
+    </w:p>
+    <w:p>
+      <w:r>
+        <w:t>{{preco_kwh}}</w:t>
+      </w:r>
+    </w:p>
+    <w:p>
+      <w:r>
+        <w:t>{{qtd_inversores}}</w:t>
+      </w:r>
+    </w:p>
+    <w:p>
+      <w:r>
+        <w:t>{{qtd_placas}}</w:t>
+      </w:r>
+    </w:p>
+    <w:p>
+      <w:r>
+        <w:t>{{reajuste_anual}}</w:t>
+      </w:r>
+    </w:p>
+    <w:p>
+      <w:r>
+        <w:t>{{tabela_12_meses}}</w:t>
+      </w:r>
+    </w:p>
+    <w:p>
+      <w:r>
+        <w:t>{{tabela_25_anos}}</w:t>
+      </w:r>
+    </w:p>
     <w:sectPr>
       <w:type w:val="continuous"/>
       <w:pgSz w:w="11906" w:h="16838"/>

</xml_diff>

<commit_message>
chore: atualizar template Word com modelo normalizado do cliente
</commit_message>
<xml_diff>
--- a/app/energia_solar/templates_word/proposta_solar_modelo.docx
+++ b/app/energia_solar/templates_word/proposta_solar_modelo.docx
@@ -18,7 +18,7 @@
         <mc:AlternateContent>
           <mc:Choice Requires="wpg">
             <w:drawing>
-              <wp:anchor distT="0" distB="0" distL="114300" distR="114300" simplePos="0" relativeHeight="251667456" behindDoc="0" locked="0" layoutInCell="1" allowOverlap="1" wp14:anchorId="197D2130" wp14:editId="21755014">
+              <wp:anchor distT="0" distB="0" distL="114300" distR="114300" simplePos="0" relativeHeight="251667456" behindDoc="0" locked="0" layoutInCell="1" allowOverlap="1" wp14:anchorId="197D2130" wp14:editId="38B0E9DC">
                 <wp:simplePos x="0" y="0"/>
                 <wp:positionH relativeFrom="column">
                   <wp:posOffset>-45085</wp:posOffset>
@@ -64,8 +64,8 @@
                           <pic:blipFill>
                             <a:blip r:embed="rId8" cstate="print">
                               <a:extLst>
-                                <a:ext uri="{28A0092B-C50C-407E-A947-70E740481C1C}">
-                                  <a14:useLocalDpi xmlns:a14="http://schemas.microsoft.com/office/drawing/2010/main" val="0"/>
+                                <a:ext uri="[28A0092B-C50C-407E-A947-70E740481C1C]">
+                                  <a14:useLocalDpi xmlns="" xmlns:o="urn:schemas-microsoft-com:office:office" xmlns:v="urn:schemas-microsoft-com:vml" xmlns:w10="urn:schemas-microsoft-com:office:word" xmlns:w="http://schemas.openxmlformats.org/wordprocessingml/2006/main" xmlns:a14="http://schemas.microsoft.com/office/drawing/2010/main" val="0"/>
                                 </a:ext>
                               </a:extLst>
                             </a:blip>
@@ -93,8 +93,8 @@
                           <pic:blipFill>
                             <a:blip r:embed="rId8" cstate="print">
                               <a:extLst>
-                                <a:ext uri="{28A0092B-C50C-407E-A947-70E740481C1C}">
-                                  <a14:useLocalDpi xmlns:a14="http://schemas.microsoft.com/office/drawing/2010/main" val="0"/>
+                                <a:ext uri="[28A0092B-C50C-407E-A947-70E740481C1C]">
+                                  <a14:useLocalDpi xmlns="" xmlns:o="urn:schemas-microsoft-com:office:office" xmlns:v="urn:schemas-microsoft-com:vml" xmlns:w10="urn:schemas-microsoft-com:office:word" xmlns:w="http://schemas.openxmlformats.org/wordprocessingml/2006/main" xmlns:a14="http://schemas.microsoft.com/office/drawing/2010/main" val="0"/>
                                 </a:ext>
                               </a:extLst>
                             </a:blip>
@@ -122,8 +122,8 @@
                           <pic:blipFill>
                             <a:blip r:embed="rId8" cstate="print">
                               <a:extLst>
-                                <a:ext uri="{28A0092B-C50C-407E-A947-70E740481C1C}">
-                                  <a14:useLocalDpi xmlns:a14="http://schemas.microsoft.com/office/drawing/2010/main" val="0"/>
+                                <a:ext uri="[28A0092B-C50C-407E-A947-70E740481C1C]">
+                                  <a14:useLocalDpi xmlns="" xmlns:o="urn:schemas-microsoft-com:office:office" xmlns:v="urn:schemas-microsoft-com:vml" xmlns:w10="urn:schemas-microsoft-com:office:word" xmlns:w="http://schemas.openxmlformats.org/wordprocessingml/2006/main" xmlns:a14="http://schemas.microsoft.com/office/drawing/2010/main" val="0"/>
                                 </a:ext>
                               </a:extLst>
                             </a:blip>
@@ -199,7 +199,7 @@
                         <wps:spPr>
                           <a:xfrm>
                             <a:off x="485775" y="5000625"/>
-                            <a:ext cx="4181475" cy="1375258"/>
+                            <a:ext cx="4791387" cy="1375258"/>
                           </a:xfrm>
                           <a:prstGeom prst="rect">
                             <a:avLst/>
@@ -237,44 +237,7 @@
                                   <w:sz w:val="24"/>
                                   <w:szCs w:val="24"/>
                                 </w:rPr>
-                                <w:fldChar w:fldCharType="begin"/>
-                              </w:r>
-                              <w:r>
-                                <w:rPr>
-                                  <w:rFonts w:cstheme="minorHAnsi"/>
-                                  <w:color w:val="001839"/>
-                                  <w:sz w:val="24"/>
-                                  <w:szCs w:val="24"/>
-                                </w:rPr>
-                                <w:instrText xml:space="preserve"> TIME \@ "dd/MM/yyyy" </w:instrText>
-                              </w:r>
-                              <w:r>
-                                <w:rPr>
-                                  <w:rFonts w:cstheme="minorHAnsi"/>
-                                  <w:color w:val="001839"/>
-                                  <w:sz w:val="24"/>
-                                  <w:szCs w:val="24"/>
-                                </w:rPr>
-                                <w:fldChar w:fldCharType="separate"/>
-                              </w:r>
-                              <w:r>
-                                <w:rPr>
-                                  <w:rFonts w:cstheme="minorHAnsi"/>
-                                  <w:noProof/>
-                                  <w:color w:val="001839"/>
-                                  <w:sz w:val="24"/>
-                                  <w:szCs w:val="24"/>
-                                </w:rPr>
-                                <w:t>23/05/2026</w:t>
-                              </w:r>
-                              <w:r>
-                                <w:rPr>
-                                  <w:rFonts w:cstheme="minorHAnsi"/>
-                                  <w:color w:val="001839"/>
-                                  <w:sz w:val="24"/>
-                                  <w:szCs w:val="24"/>
-                                </w:rPr>
-                                <w:fldChar w:fldCharType="end"/>
+                                <w:t>[DATA_PROPOSTA]</w:t>
                               </w:r>
                               <w:r>
                                 <w:rPr>
@@ -292,8 +255,8 @@
                                 <w:rPr>
                                   <w:rFonts w:cstheme="minorHAnsi"/>
                                   <w:color w:val="001839"/>
-                                  <w:sz w:val="16"/>
-                                  <w:szCs w:val="16"/>
+                                  <w:sz w:val="24"/>
+                                  <w:szCs w:val="24"/>
                                 </w:rPr>
                               </w:pPr>
                               <w:r>
@@ -303,7 +266,7 @@
                                   <w:sz w:val="24"/>
                                   <w:szCs w:val="24"/>
                                 </w:rPr>
-                                <w:t>{{NOME_CLIENTE}}</w:t>
+                                <w:t>[NOME_CLIENTE]</w:t>
                               </w:r>
                             </w:p>
                             <w:p>
@@ -332,7 +295,7 @@
                                   <w:sz w:val="24"/>
                                   <w:szCs w:val="24"/>
                                 </w:rPr>
-                                <w:t>7</w:t>
+                                <w:t>15</w:t>
                               </w:r>
                               <w:r>
                                 <w:rPr>
@@ -379,7 +342,7 @@
                                   <w:sz w:val="24"/>
                                   <w:szCs w:val="24"/>
                                 </w:rPr>
-                                <w:t>{{NUMERO_PROJETO}}</w:t>
+                                <w:t>[NUMERO_PROJETO]</w:t>
                               </w:r>
                             </w:p>
                           </w:txbxContent>
@@ -396,8 +359,8 @@
                         <wps:cNvSpPr txBox="1"/>
                         <wps:spPr>
                           <a:xfrm>
-                            <a:off x="2076450" y="9182100"/>
-                            <a:ext cx="1771650" cy="247650"/>
+                            <a:off x="1276414" y="9182100"/>
+                            <a:ext cx="2571685" cy="247650"/>
                           </a:xfrm>
                           <a:prstGeom prst="rect">
                             <a:avLst/>
@@ -943,7 +906,7 @@
           </mc:Choice>
           <mc:Fallback>
             <w:pict>
-              <v:group w14:anchorId="197D2130" id="Agrupar 18" o:spid="_x0000_s1026" style="position:absolute;margin-left:-3.55pt;margin-top:14.4pt;width:484.35pt;height:492.75pt;z-index:251667456;mso-width-relative:margin;mso-height-relative:margin" coordorigin="2381,31718" coordsize="61516,62579" o:gfxdata="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">
+              <v:group w14:anchorId="197D2130" id="Agrupar 18" o:spid="_x0000_s1026" style="position:absolute;margin-left:-3.55pt;margin-top:14.4pt;width:484.35pt;height:492.75pt;z-index:251667456;mso-width-relative:margin;mso-height-relative:margin" coordorigin="2381,31718" coordsize="61516,62579" o:gfxdata="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">
                 <v:group id="Agrupar 5" o:spid="_x0000_s1027" style="position:absolute;left:2381;top:71342;width:2354;height:7964" coordorigin=",-571" coordsize="2354,7963" o:gfxdata="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">
                   <v:shape id="Imagem 1" o:spid="_x0000_s1028" type="#_x0000_t75" style="position:absolute;top:-571;width:2311;height:2069;visibility:visible;mso-wrap-style:square" o:gfxdata="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">
                     <v:imagedata r:id="rId10" o:title=""/>
@@ -989,7 +952,7 @@
                     </w:txbxContent>
                   </v:textbox>
                 </v:shape>
-                <v:shape id="Caixa de Texto 2" o:spid="_x0000_s1032" type="#_x0000_t202" style="position:absolute;left:4857;top:50006;width:41815;height:13752;visibility:visible;mso-wrap-style:square;v-text-anchor:top" o:gfxdata="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" filled="f" stroked="f" strokeweight=".5pt">
+                <v:shape id="Caixa de Texto 2" o:spid="_x0000_s1032" type="#_x0000_t202" style="position:absolute;left:4857;top:50006;width:47914;height:13752;visibility:visible;mso-wrap-style:square;v-text-anchor:top" o:gfxdata="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" filled="f" stroked="f" strokeweight=".5pt">
                   <v:textbox inset="0,0,0,0">
                     <w:txbxContent>
                       <w:p>
@@ -1018,44 +981,7 @@
                             <w:sz w:val="24"/>
                             <w:szCs w:val="24"/>
                           </w:rPr>
-                          <w:fldChar w:fldCharType="begin"/>
-                        </w:r>
-                        <w:r>
-                          <w:rPr>
-                            <w:rFonts w:cstheme="minorHAnsi"/>
-                            <w:color w:val="001839"/>
-                            <w:sz w:val="24"/>
-                            <w:szCs w:val="24"/>
-                          </w:rPr>
-                          <w:instrText xml:space="preserve"> TIME \@ "dd/MM/yyyy" </w:instrText>
-                        </w:r>
-                        <w:r>
-                          <w:rPr>
-                            <w:rFonts w:cstheme="minorHAnsi"/>
-                            <w:color w:val="001839"/>
-                            <w:sz w:val="24"/>
-                            <w:szCs w:val="24"/>
-                          </w:rPr>
-                          <w:fldChar w:fldCharType="separate"/>
-                        </w:r>
-                        <w:r>
-                          <w:rPr>
-                            <w:rFonts w:cstheme="minorHAnsi"/>
-                            <w:noProof/>
-                            <w:color w:val="001839"/>
-                            <w:sz w:val="24"/>
-                            <w:szCs w:val="24"/>
-                          </w:rPr>
-                          <w:t>23/05/2026</w:t>
-                        </w:r>
-                        <w:r>
-                          <w:rPr>
-                            <w:rFonts w:cstheme="minorHAnsi"/>
-                            <w:color w:val="001839"/>
-                            <w:sz w:val="24"/>
-                            <w:szCs w:val="24"/>
-                          </w:rPr>
-                          <w:fldChar w:fldCharType="end"/>
+                          <w:t>[DATA_PROPOSTA]</w:t>
                         </w:r>
                         <w:r>
                           <w:rPr>
@@ -1073,8 +999,8 @@
                           <w:rPr>
                             <w:rFonts w:cstheme="minorHAnsi"/>
                             <w:color w:val="001839"/>
-                            <w:sz w:val="16"/>
-                            <w:szCs w:val="16"/>
+                            <w:sz w:val="24"/>
+                            <w:szCs w:val="24"/>
                           </w:rPr>
                         </w:pPr>
                         <w:r>
@@ -1084,7 +1010,7 @@
                             <w:sz w:val="24"/>
                             <w:szCs w:val="24"/>
                           </w:rPr>
-                          <w:t>{{NOME_CLIENTE}}</w:t>
+                          <w:t>[NOME_CLIENTE]</w:t>
                         </w:r>
                       </w:p>
                       <w:p>
@@ -1113,7 +1039,7 @@
                             <w:sz w:val="24"/>
                             <w:szCs w:val="24"/>
                           </w:rPr>
-                          <w:t>7</w:t>
+                          <w:t>15</w:t>
                         </w:r>
                         <w:r>
                           <w:rPr>
@@ -1160,13 +1086,13 @@
                             <w:sz w:val="24"/>
                             <w:szCs w:val="24"/>
                           </w:rPr>
-                          <w:t>{{NUMERO_PROJETO}}</w:t>
+                          <w:t>[NUMERO_PROJETO]</w:t>
                         </w:r>
                       </w:p>
                     </w:txbxContent>
                   </v:textbox>
                 </v:shape>
-                <v:shape id="Caixa de Texto 2" o:spid="_x0000_s1033" type="#_x0000_t202" style="position:absolute;left:20764;top:91821;width:17717;height:2476;visibility:visible;mso-wrap-style:square;v-text-anchor:top" o:gfxdata="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" filled="f" stroked="f" strokeweight=".5pt">
+                <v:shape id="Caixa de Texto 2" o:spid="_x0000_s1033" type="#_x0000_t202" style="position:absolute;left:12764;top:91821;width:25716;height:2476;visibility:visible;mso-wrap-style:square;v-text-anchor:top" o:gfxdata="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" filled="f" stroked="f" strokeweight=".5pt">
                   <v:textbox inset="0,0,0,0">
                     <w:txbxContent>
                       <w:p>
@@ -1687,8 +1613,8 @@
                   <pic:blipFill>
                     <a:blip r:embed="rId15" cstate="print">
                       <a:extLst>
-                        <a:ext uri="{28A0092B-C50C-407E-A947-70E740481C1C}">
-                          <a14:useLocalDpi xmlns:a14="http://schemas.microsoft.com/office/drawing/2010/main" val="0"/>
+                        <a:ext uri="[28A0092B-C50C-407E-A947-70E740481C1C]">
+                          <a14:useLocalDpi xmlns="" xmlns:o="urn:schemas-microsoft-com:office:office" xmlns:v="urn:schemas-microsoft-com:vml" xmlns:w10="urn:schemas-microsoft-com:office:word" xmlns:w="http://schemas.openxmlformats.org/wordprocessingml/2006/main" xmlns:a14="http://schemas.microsoft.com/office/drawing/2010/main" val="0"/>
                         </a:ext>
                       </a:extLst>
                     </a:blip>
@@ -3168,7 +3094,7 @@
           <w:sz w:val="24"/>
           <w:szCs w:val="24"/>
         </w:rPr>
-        <w:t>{{CONSUMO_MENSAL}}</w:t>
+        <w:t>[CONSUMO_MENSAL]</w:t>
       </w:r>
     </w:p>
     <w:p>
@@ -3215,7 +3141,7 @@
           <w:sz w:val="24"/>
           <w:szCs w:val="24"/>
         </w:rPr>
-        <w:t>{{CONSUMO_ANUAL}}</w:t>
+        <w:t>[CONSUMO_ANUAL]</w:t>
       </w:r>
     </w:p>
     <w:p>
@@ -3240,16 +3166,18 @@
           <w:sz w:val="24"/>
           <w:szCs w:val="24"/>
         </w:rPr>
-        <w:t>Preço do KWh:</w:t>
-      </w:r>
-      <w:r>
-        <w:rPr>
-          <w:rFonts w:cstheme="minorHAnsi"/>
+        <w:t>Valor da fatura sem sistema</w:t>
+      </w:r>
+      <w:r>
+        <w:rPr>
+          <w:rFonts w:cstheme="minorHAnsi"/>
+          <w:b/>
+          <w:bCs/>
           <w:color w:val="0F224B"/>
           <w:sz w:val="24"/>
           <w:szCs w:val="24"/>
         </w:rPr>
-        <w:t xml:space="preserve"> </w:t>
+        <w:t>:</w:t>
       </w:r>
       <w:r>
         <w:rPr>
@@ -3258,22 +3186,37 @@
           <w:sz w:val="24"/>
           <w:szCs w:val="24"/>
         </w:rPr>
-        <w:t>[</w:t>
-      </w:r>
-      <w:proofErr w:type="spellStart"/>
-      <w:r>
-        <w:rPr>
-          <w:rFonts w:cstheme="minorHAnsi"/>
+        <w:t xml:space="preserve"> </w:t>
+      </w:r>
+      <w:r>
+        <w:rPr>
+          <w:rFonts w:cstheme="minorHAnsi"/>
+          <w:b/>
+          <w:bCs/>
           <w:color w:val="0F224B"/>
           <w:sz w:val="24"/>
           <w:szCs w:val="24"/>
         </w:rPr>
-        <w:t>preco_kwh</w:t>
+        <w:t>R$[</w:t>
+      </w:r>
+      <w:proofErr w:type="spellStart"/>
+      <w:r>
+        <w:rPr>
+          <w:rFonts w:cstheme="minorHAnsi"/>
+          <w:b/>
+          <w:bCs/>
+          <w:color w:val="0F224B"/>
+          <w:sz w:val="24"/>
+          <w:szCs w:val="24"/>
+        </w:rPr>
+        <w:t>fatura_media_mensal_sem_sistema</w:t>
       </w:r>
       <w:proofErr w:type="spellEnd"/>
       <w:r>
         <w:rPr>
           <w:rFonts w:cstheme="minorHAnsi"/>
+          <w:b/>
+          <w:bCs/>
           <w:color w:val="0F224B"/>
           <w:sz w:val="24"/>
           <w:szCs w:val="24"/>
@@ -3574,7 +3517,7 @@
           <w:sz w:val="24"/>
           <w:szCs w:val="24"/>
         </w:rPr>
-        <w:t>{{ENDERECO_CLIENTE}}</w:t>
+        <w:t>[ENDERECO_CLIENTE]</w:t>
       </w:r>
       <w:r>
         <w:rPr>
@@ -3596,8 +3539,9 @@
           <w:sz w:val="24"/>
           <w:szCs w:val="24"/>
         </w:rPr>
-        <w:t>{{CIDADE}}</w:t>
-      </w:r>
+        <w:t>[CIDADE</w:t>
+      </w:r>
+      <w:proofErr w:type="gramStart"/>
       <w:r>
         <w:rPr>
           <w:rFonts w:cstheme="minorHAnsi"/>
@@ -3607,7 +3551,7 @@
           <w:sz w:val="24"/>
           <w:szCs w:val="24"/>
         </w:rPr>
-        <w:t>,</w:t>
+        <w:t>]</w:t>
       </w:r>
       <w:r>
         <w:rPr>
@@ -3618,7 +3562,30 @@
           <w:sz w:val="24"/>
           <w:szCs w:val="24"/>
         </w:rPr>
-        <w:t>{{ESTADO}}</w:t>
+        <w:t>,</w:t>
+      </w:r>
+      <w:r>
+        <w:rPr>
+          <w:rFonts w:cstheme="minorHAnsi"/>
+          <w:b/>
+          <w:bCs/>
+          <w:color w:val="0F224B"/>
+          <w:sz w:val="24"/>
+          <w:szCs w:val="24"/>
+        </w:rPr>
+        <w:t>[</w:t>
+      </w:r>
+      <w:proofErr w:type="gramEnd"/>
+      <w:r>
+        <w:rPr>
+          <w:rFonts w:cstheme="minorHAnsi"/>
+          <w:b/>
+          <w:bCs/>
+          <w:color w:val="0F224B"/>
+          <w:sz w:val="24"/>
+          <w:szCs w:val="24"/>
+        </w:rPr>
+        <w:t>ESTADO]</w:t>
       </w:r>
       <w:r>
         <w:rPr>
@@ -3678,7 +3645,7 @@
           <w:sz w:val="24"/>
           <w:szCs w:val="24"/>
         </w:rPr>
-        <w:t>{{IRRADIACAO_SOLAR}}</w:t>
+        <w:t>[IRRADIACAO_SOLAR]</w:t>
       </w:r>
     </w:p>
     <w:p>
@@ -3727,7 +3694,7 @@
           <w:sz w:val="24"/>
           <w:szCs w:val="24"/>
         </w:rPr>
-        <w:t>{{POTENCIA_SISTEMA}}</w:t>
+        <w:t>[POTENCIA_SISTEMA]</w:t>
       </w:r>
     </w:p>
     <w:p>
@@ -3776,7 +3743,7 @@
           <w:sz w:val="24"/>
           <w:szCs w:val="24"/>
         </w:rPr>
-        <w:t>{{GERACAO_MENSAL}}</w:t>
+        <w:t>[GERACAO_MENSAL]</w:t>
       </w:r>
     </w:p>
     <w:p>
@@ -3825,7 +3792,7 @@
           <w:sz w:val="24"/>
           <w:szCs w:val="24"/>
         </w:rPr>
-        <w:t>{{AREA_NECESSARIA}}</w:t>
+        <w:t>[AREA_NECESSARIA]</w:t>
       </w:r>
     </w:p>
     <w:p/>
@@ -3896,17 +3863,15 @@
         <w:jc w:val="both"/>
         <w:rPr>
           <w:rFonts w:cstheme="minorHAnsi"/>
-          <w:sz w:val="20"/>
-          <w:szCs w:val="20"/>
-        </w:rPr>
-      </w:pPr>
-      <w:r>
-        <w:rPr>
-          <w:rFonts w:cstheme="minorHAnsi"/>
-          <w:sz w:val="20"/>
-          <w:szCs w:val="20"/>
-        </w:rPr>
-        <w:t>[grafico_consumo_geracao_12_meses]</w:t>
+          <w:color w:val="0F224B"/>
+        </w:rPr>
+      </w:pPr>
+      <w:r>
+        <w:rPr>
+          <w:rFonts w:cstheme="minorHAnsi"/>
+          <w:color w:val="0F224B"/>
+        </w:rPr>
+        <w:t xml:space="preserve">[grafico_consumo_geracao_12_meses] </w:t>
       </w:r>
     </w:p>
     <w:p>
@@ -3915,15 +3880,13 @@
         <w:jc w:val="both"/>
         <w:rPr>
           <w:rFonts w:cstheme="minorHAnsi"/>
-          <w:sz w:val="20"/>
-          <w:szCs w:val="20"/>
-        </w:rPr>
-      </w:pPr>
-      <w:r>
-        <w:rPr>
-          <w:rFonts w:cstheme="minorHAnsi"/>
-          <w:sz w:val="20"/>
-          <w:szCs w:val="20"/>
+          <w:color w:val="0F224B"/>
+        </w:rPr>
+      </w:pPr>
+      <w:r>
+        <w:rPr>
+          <w:rFonts w:cstheme="minorHAnsi"/>
+          <w:color w:val="0F224B"/>
         </w:rPr>
         <w:t>[tabela_12_meses]</w:t>
       </w:r>
@@ -4023,10 +3986,38 @@
       <w:r>
         <w:rPr>
           <w:rFonts w:cstheme="minorHAnsi"/>
+          <w:color w:val="0F224B"/>
+        </w:rPr>
+        <w:t>[grafico_consumo_geracao_25_anos]</w:t>
+      </w:r>
+      <w:r>
+        <w:rPr>
+          <w:rFonts w:cstheme="minorHAnsi"/>
           <w:sz w:val="20"/>
           <w:szCs w:val="20"/>
         </w:rPr>
-        <w:t>[grafico_consumo_geracao_25_anos]</w:t>
+        <w:br/>
+      </w:r>
+      <w:r>
+        <w:rPr>
+          <w:rFonts w:cstheme="minorHAnsi"/>
+          <w:color w:val="0F224B"/>
+        </w:rPr>
+        <w:t>[</w:t>
+      </w:r>
+      <w:r>
+        <w:rPr>
+          <w:rFonts w:cstheme="minorHAnsi"/>
+          <w:color w:val="0F224B"/>
+        </w:rPr>
+        <w:t>tabela_25_anos</w:t>
+      </w:r>
+      <w:r>
+        <w:rPr>
+          <w:rFonts w:cstheme="minorHAnsi"/>
+          <w:color w:val="0F224B"/>
+        </w:rPr>
+        <w:t>]</w:t>
       </w:r>
     </w:p>
     <w:p>
@@ -4198,15 +4189,13 @@
         </w:rPr>
         <w:t>[</w:t>
       </w:r>
-      <w:proofErr w:type="spellStart"/>
-      <w:r>
-        <w:rPr>
-          <w:rFonts w:cstheme="minorHAnsi"/>
-          <w:color w:val="0F224B"/>
-        </w:rPr>
-        <w:t>placa_modelo</w:t>
-      </w:r>
-      <w:proofErr w:type="spellEnd"/>
+      <w:r>
+        <w:rPr>
+          <w:rFonts w:cstheme="minorHAnsi"/>
+          <w:color w:val="0F224B"/>
+        </w:rPr>
+        <w:t>MODELO_MODULO</w:t>
+      </w:r>
       <w:r>
         <w:rPr>
           <w:rFonts w:cstheme="minorHAnsi"/>
@@ -4246,15 +4235,13 @@
         </w:rPr>
         <w:t>[</w:t>
       </w:r>
-      <w:proofErr w:type="spellStart"/>
-      <w:r>
-        <w:rPr>
-          <w:rFonts w:cstheme="minorHAnsi"/>
-          <w:color w:val="0F224B"/>
-        </w:rPr>
-        <w:t>placa_fabricante</w:t>
-      </w:r>
-      <w:proofErr w:type="spellEnd"/>
+      <w:r>
+        <w:rPr>
+          <w:rFonts w:cstheme="minorHAnsi"/>
+          <w:color w:val="0F224B"/>
+        </w:rPr>
+        <w:t>FABRICANTE_MODULO</w:t>
+      </w:r>
       <w:r>
         <w:rPr>
           <w:rFonts w:cstheme="minorHAnsi"/>
@@ -4294,28 +4281,19 @@
         </w:rPr>
         <w:t>[</w:t>
       </w:r>
-      <w:proofErr w:type="spellStart"/>
-      <w:r>
-        <w:rPr>
-          <w:rFonts w:cstheme="minorHAnsi"/>
-          <w:color w:val="0F224B"/>
-        </w:rPr>
-        <w:t>placa_potencia</w:t>
-      </w:r>
-      <w:proofErr w:type="spellEnd"/>
+      <w:r>
+        <w:rPr>
+          <w:rFonts w:cstheme="minorHAnsi"/>
+          <w:color w:val="0F224B"/>
+        </w:rPr>
+        <w:t>POTENCIA_MODULO</w:t>
+      </w:r>
       <w:r>
         <w:rPr>
           <w:rFonts w:cstheme="minorHAnsi"/>
           <w:color w:val="0F224B"/>
         </w:rPr>
         <w:t>]</w:t>
-      </w:r>
-      <w:r>
-        <w:rPr>
-          <w:rFonts w:cstheme="minorHAnsi"/>
-          <w:color w:val="0F224B"/>
-        </w:rPr>
-        <w:t xml:space="preserve"> </w:t>
       </w:r>
     </w:p>
     <w:p>
@@ -4364,22 +4342,36 @@
         </w:rPr>
         <w:t>[</w:t>
       </w:r>
+      <w:r>
+        <w:rPr>
+          <w:rFonts w:cstheme="minorHAnsi"/>
+          <w:color w:val="0F224B"/>
+        </w:rPr>
+        <w:t>QTD_MODULOS</w:t>
+      </w:r>
+      <w:r>
+        <w:rPr>
+          <w:rFonts w:cstheme="minorHAnsi"/>
+          <w:color w:val="0F224B"/>
+        </w:rPr>
+        <w:t>]</w:t>
+      </w:r>
+      <w:r>
+        <w:rPr>
+          <w:rFonts w:cstheme="minorHAnsi"/>
+          <w:color w:val="0F224B"/>
+        </w:rPr>
+        <w:t xml:space="preserve"> </w:t>
+      </w:r>
       <w:proofErr w:type="spellStart"/>
       <w:r>
         <w:rPr>
           <w:rFonts w:cstheme="minorHAnsi"/>
           <w:color w:val="0F224B"/>
         </w:rPr>
-        <w:t>qtd_placas</w:t>
+        <w:t>Unid</w:t>
       </w:r>
       <w:proofErr w:type="spellEnd"/>
-      <w:r>
-        <w:rPr>
-          <w:rFonts w:cstheme="minorHAnsi"/>
-          <w:color w:val="0F224B"/>
-        </w:rPr>
-        <w:t>]</w:t>
-      </w:r>
     </w:p>
     <w:p>
       <w:pPr>
@@ -4475,6 +4467,15 @@
       <w:r>
         <w:rPr>
           <w:rFonts w:cstheme="minorHAnsi"/>
+          <w:b/>
+          <w:bCs/>
+          <w:color w:val="0F224B"/>
+        </w:rPr>
+        <w:t xml:space="preserve"> </w:t>
+      </w:r>
+      <w:r>
+        <w:rPr>
+          <w:rFonts w:cstheme="minorHAnsi"/>
           <w:color w:val="0F224B"/>
         </w:rPr>
         <w:t>[</w:t>
@@ -4520,8 +4521,6 @@
       <w:r>
         <w:rPr>
           <w:rFonts w:cstheme="minorHAnsi"/>
-          <w:b/>
-          <w:bCs/>
           <w:color w:val="0F224B"/>
         </w:rPr>
         <w:t>[</w:t>
@@ -4530,8 +4529,6 @@
       <w:r>
         <w:rPr>
           <w:rFonts w:cstheme="minorHAnsi"/>
-          <w:b/>
-          <w:bCs/>
           <w:color w:val="0F224B"/>
         </w:rPr>
         <w:t>inversor_potencia</w:t>
@@ -4540,8 +4537,6 @@
       <w:r>
         <w:rPr>
           <w:rFonts w:cstheme="minorHAnsi"/>
-          <w:b/>
-          <w:bCs/>
           <w:color w:val="0F224B"/>
         </w:rPr>
         <w:t>]</w:t>
@@ -4615,6 +4610,22 @@
         </w:rPr>
         <w:t>]</w:t>
       </w:r>
+      <w:r>
+        <w:rPr>
+          <w:rFonts w:cstheme="minorHAnsi"/>
+          <w:color w:val="0F224B"/>
+        </w:rPr>
+        <w:t xml:space="preserve"> </w:t>
+      </w:r>
+      <w:proofErr w:type="spellStart"/>
+      <w:r>
+        <w:rPr>
+          <w:rFonts w:cstheme="minorHAnsi"/>
+          <w:color w:val="0F224B"/>
+        </w:rPr>
+        <w:t>Unid</w:t>
+      </w:r>
+      <w:proofErr w:type="spellEnd"/>
     </w:p>
     <w:p>
       <w:pPr>
@@ -4777,7 +4788,7 @@
     <w:p>
       <w:pPr>
         <w:tabs>
-          <w:tab w:val="left" w:pos="2977"/>
+          <w:tab w:val="left" w:pos="1276"/>
         </w:tabs>
         <w:rPr>
           <w:rFonts w:cstheme="minorHAnsi"/>
@@ -4799,6 +4810,7 @@
           <w:color w:val="0F224B"/>
           <w:sz w:val="36"/>
           <w:szCs w:val="36"/>
+          <w:highlight w:val="yellow"/>
         </w:rPr>
         <w:t xml:space="preserve">Com Sistema </w:t>
       </w:r>
@@ -4808,26 +4820,39 @@
           <w:color w:val="0F224B"/>
           <w:sz w:val="36"/>
           <w:szCs w:val="36"/>
-        </w:rPr>
-        <w:t>[</w:t>
-      </w:r>
-      <w:proofErr w:type="spellStart"/>
+          <w:highlight w:val="yellow"/>
+        </w:rPr>
+        <w:t>R$</w:t>
+      </w:r>
       <w:r>
         <w:rPr>
           <w:rFonts w:cstheme="minorHAnsi"/>
           <w:color w:val="0F224B"/>
           <w:sz w:val="36"/>
           <w:szCs w:val="36"/>
-        </w:rPr>
-        <w:t>fatura_minima</w:t>
-      </w:r>
-      <w:proofErr w:type="spellEnd"/>
+          <w:highlight w:val="yellow"/>
+        </w:rPr>
+        <w:t>[</w:t>
+      </w:r>
+      <w:proofErr w:type="spellStart"/>
       <w:r>
         <w:rPr>
           <w:rFonts w:cstheme="minorHAnsi"/>
           <w:color w:val="0F224B"/>
           <w:sz w:val="36"/>
           <w:szCs w:val="36"/>
+          <w:highlight w:val="yellow"/>
+        </w:rPr>
+        <w:t>fatura_minima</w:t>
+      </w:r>
+      <w:proofErr w:type="spellEnd"/>
+      <w:r>
+        <w:rPr>
+          <w:rFonts w:cstheme="minorHAnsi"/>
+          <w:color w:val="0F224B"/>
+          <w:sz w:val="36"/>
+          <w:szCs w:val="36"/>
+          <w:highlight w:val="yellow"/>
         </w:rPr>
         <w:t>]</w:t>
       </w:r>
@@ -4869,6 +4894,15 @@
           <w:szCs w:val="32"/>
         </w:rPr>
         <w:t xml:space="preserve"> </w:t>
+      </w:r>
+      <w:r>
+        <w:rPr>
+          <w:rFonts w:cstheme="minorHAnsi"/>
+          <w:color w:val="0F224B"/>
+          <w:sz w:val="36"/>
+          <w:szCs w:val="36"/>
+        </w:rPr>
+        <w:t>R$</w:t>
       </w:r>
       <w:r>
         <w:rPr>
@@ -4949,8 +4983,8 @@
                   <pic:blipFill>
                     <a:blip r:embed="rId15" cstate="print">
                       <a:extLst>
-                        <a:ext uri="{28A0092B-C50C-407E-A947-70E740481C1C}">
-                          <a14:useLocalDpi xmlns:a14="http://schemas.microsoft.com/office/drawing/2010/main" val="0"/>
+                        <a:ext uri="[28A0092B-C50C-407E-A947-70E740481C1C]">
+                          <a14:useLocalDpi xmlns="" xmlns:o="urn:schemas-microsoft-com:office:office" xmlns:v="urn:schemas-microsoft-com:vml" xmlns:w10="urn:schemas-microsoft-com:office:word" xmlns:w="http://schemas.openxmlformats.org/wordprocessingml/2006/main" xmlns:a14="http://schemas.microsoft.com/office/drawing/2010/main" val="0"/>
                         </a:ext>
                       </a:extLst>
                     </a:blip>
@@ -5022,20 +5056,32 @@
           <w:b/>
           <w:bCs/>
           <w:color w:val="0F224B"/>
-          <w:sz w:val="36"/>
-          <w:szCs w:val="36"/>
-        </w:rPr>
-      </w:pPr>
-      <w:r>
-        <w:rPr>
-          <w:rFonts w:cstheme="minorHAnsi"/>
-          <w:b/>
-          <w:bCs/>
-          <w:color w:val="0F224B"/>
-          <w:sz w:val="36"/>
-          <w:szCs w:val="36"/>
+          <w:sz w:val="40"/>
+          <w:szCs w:val="40"/>
+        </w:rPr>
+      </w:pPr>
+      <w:r>
+        <w:rPr>
+          <w:rFonts w:cstheme="minorHAnsi"/>
+          <w:b/>
+          <w:bCs/>
+          <w:color w:val="0F224B"/>
+          <w:sz w:val="40"/>
+          <w:szCs w:val="40"/>
           <w:highlight w:val="yellow"/>
         </w:rPr>
+        <w:t xml:space="preserve">R$ </w:t>
+      </w:r>
+      <w:r>
+        <w:rPr>
+          <w:rFonts w:cstheme="minorHAnsi"/>
+          <w:b/>
+          <w:bCs/>
+          <w:color w:val="0F224B"/>
+          <w:sz w:val="40"/>
+          <w:szCs w:val="40"/>
+          <w:highlight w:val="yellow"/>
+        </w:rPr>
         <w:t>[</w:t>
       </w:r>
       <w:proofErr w:type="spellStart"/>
@@ -5045,8 +5091,8 @@
           <w:b/>
           <w:bCs/>
           <w:color w:val="0F224B"/>
-          <w:sz w:val="36"/>
-          <w:szCs w:val="36"/>
+          <w:sz w:val="40"/>
+          <w:szCs w:val="40"/>
           <w:highlight w:val="yellow"/>
         </w:rPr>
         <w:t>orcamento_valor_nota</w:t>
@@ -5058,8 +5104,8 @@
           <w:b/>
           <w:bCs/>
           <w:color w:val="0F224B"/>
-          <w:sz w:val="36"/>
-          <w:szCs w:val="36"/>
+          <w:sz w:val="40"/>
+          <w:szCs w:val="40"/>
           <w:highlight w:val="yellow"/>
         </w:rPr>
         <w:t>]</w:t>
@@ -5112,8 +5158,8 @@
                   <pic:blipFill>
                     <a:blip r:embed="rId15" cstate="print">
                       <a:extLst>
-                        <a:ext uri="{28A0092B-C50C-407E-A947-70E740481C1C}">
-                          <a14:useLocalDpi xmlns:a14="http://schemas.microsoft.com/office/drawing/2010/main" val="0"/>
+                        <a:ext uri="[28A0092B-C50C-407E-A947-70E740481C1C]">
+                          <a14:useLocalDpi xmlns="" xmlns:o="urn:schemas-microsoft-com:office:office" xmlns:v="urn:schemas-microsoft-com:vml" xmlns:w10="urn:schemas-microsoft-com:office:word" xmlns:w="http://schemas.openxmlformats.org/wordprocessingml/2006/main" xmlns:a14="http://schemas.microsoft.com/office/drawing/2010/main" val="0"/>
                         </a:ext>
                       </a:extLst>
                     </a:blip>
@@ -5427,37 +5473,6 @@
         </w:tabs>
         <w:rPr>
           <w:rFonts w:cstheme="minorHAnsi"/>
-          <w:sz w:val="20"/>
-          <w:szCs w:val="18"/>
-        </w:rPr>
-      </w:pPr>
-      <w:r>
-        <w:rPr>
-          <w:rFonts w:cstheme="minorHAnsi"/>
-          <w:sz w:val="20"/>
-          <w:szCs w:val="18"/>
-        </w:rPr>
-        <w:t>[tabela_25_anos]</w:t>
-      </w:r>
-    </w:p>
-    <w:p>
-      <w:pPr>
-        <w:tabs>
-          <w:tab w:val="left" w:pos="2175"/>
-        </w:tabs>
-        <w:rPr>
-          <w:rFonts w:cstheme="minorHAnsi"/>
-          <w:sz w:val="24"/>
-        </w:rPr>
-      </w:pPr>
-    </w:p>
-    <w:p>
-      <w:pPr>
-        <w:tabs>
-          <w:tab w:val="left" w:pos="2175"/>
-        </w:tabs>
-        <w:rPr>
-          <w:rFonts w:cstheme="minorHAnsi"/>
           <w:sz w:val="24"/>
         </w:rPr>
       </w:pPr>
@@ -5554,6 +5569,7 @@
           <w:sz w:val="56"/>
           <w:szCs w:val="56"/>
         </w:rPr>
+        <w:lastRenderedPageBreak/>
         <w:drawing>
           <wp:inline distT="0" distB="0" distL="0" distR="0" wp14:anchorId="6E23E956" wp14:editId="51DE2025">
             <wp:extent cx="267970" cy="250190"/>
@@ -5574,8 +5590,8 @@
                   <pic:blipFill>
                     <a:blip r:embed="rId20">
                       <a:extLst>
-                        <a:ext uri="{28A0092B-C50C-407E-A947-70E740481C1C}">
-                          <a14:useLocalDpi xmlns:a14="http://schemas.microsoft.com/office/drawing/2010/main" val="0"/>
+                        <a:ext uri="[28A0092B-C50C-407E-A947-70E740481C1C]">
+                          <a14:useLocalDpi xmlns="" xmlns:o="urn:schemas-microsoft-com:office:office" xmlns:v="urn:schemas-microsoft-com:vml" xmlns:w10="urn:schemas-microsoft-com:office:word" xmlns:w="http://schemas.openxmlformats.org/wordprocessingml/2006/main" xmlns:a14="http://schemas.microsoft.com/office/drawing/2010/main" val="0"/>
                         </a:ext>
                       </a:extLst>
                     </a:blip>
@@ -6163,8 +6179,8 @@
         <w:jc w:val="center"/>
         <w:rPr>
           <w:rFonts w:cstheme="minorHAnsi"/>
-          <w:sz w:val="16"/>
-          <w:szCs w:val="16"/>
+          <w:sz w:val="18"/>
+          <w:szCs w:val="18"/>
         </w:rPr>
       </w:pPr>
       <w:r>
@@ -6179,7 +6195,7 @@
           <w:lang w:eastAsia="pt-BR"/>
           <w14:ligatures w14:val="none"/>
         </w:rPr>
-        <w:t>0</w:t>
+        <w:t>[</w:t>
       </w:r>
       <w:r>
         <w:rPr>
@@ -6193,7 +6209,7 @@
           <w:lang w:eastAsia="pt-BR"/>
           <w14:ligatures w14:val="none"/>
         </w:rPr>
-        <w:t>0/</w:t>
+        <w:t>VALIDADE_PROPOSTA</w:t>
       </w:r>
       <w:r>
         <w:rPr>
@@ -6207,46 +6223,8 @@
           <w:lang w:eastAsia="pt-BR"/>
           <w14:ligatures w14:val="none"/>
         </w:rPr>
-        <w:t>00</w:t>
-      </w:r>
-      <w:r>
-        <w:rPr>
-          <w:rFonts w:ascii="Roboto" w:eastAsia="Times New Roman" w:hAnsi="Roboto" w:cs="Times New Roman"/>
-          <w:b/>
-          <w:bCs/>
-          <w:color w:val="FFC000"/>
-          <w:kern w:val="0"/>
-          <w:sz w:val="36"/>
-          <w:szCs w:val="36"/>
-          <w:lang w:eastAsia="pt-BR"/>
-          <w14:ligatures w14:val="none"/>
-        </w:rPr>
-        <w:t>/2</w:t>
-      </w:r>
-      <w:r>
-        <w:rPr>
-          <w:rFonts w:ascii="Roboto" w:eastAsia="Times New Roman" w:hAnsi="Roboto" w:cs="Times New Roman"/>
-          <w:b/>
-          <w:bCs/>
-          <w:color w:val="FFC000"/>
-          <w:kern w:val="0"/>
-          <w:sz w:val="36"/>
-          <w:szCs w:val="36"/>
-          <w:lang w:eastAsia="pt-BR"/>
-          <w14:ligatures w14:val="none"/>
-        </w:rPr>
-        <w:t>6</w:t>
-      </w:r>
-    </w:p>
-    <w:p>
-      <w:pPr>
-        <w:spacing w:after="0"/>
-        <w:rPr>
-          <w:rFonts w:cstheme="minorHAnsi"/>
-          <w:sz w:val="18"/>
-          <w:szCs w:val="18"/>
-        </w:rPr>
-      </w:pPr>
+        <w:t>]</w:t>
+      </w:r>
     </w:p>
     <w:p>
       <w:pPr>
@@ -6561,8 +6539,19 @@
           <w:sz w:val="28"/>
           <w:szCs w:val="28"/>
         </w:rPr>
-        <w:t>@E.S.EletricaSaroba</w:t>
-      </w:r>
+        <w:t>@E.</w:t>
+      </w:r>
+      <w:proofErr w:type="gramStart"/>
+      <w:r>
+        <w:rPr>
+          <w:rFonts w:ascii="Bahnschrift" w:hAnsi="Bahnschrift" w:cstheme="minorHAnsi"/>
+          <w:color w:val="0F224B"/>
+          <w:sz w:val="28"/>
+          <w:szCs w:val="28"/>
+        </w:rPr>
+        <w:t>S.EletricaSaroba</w:t>
+      </w:r>
+      <w:proofErr w:type="gramEnd"/>
     </w:p>
     <w:p>
       <w:pPr>
@@ -6892,462 +6881,6 @@
           <w:szCs w:val="28"/>
         </w:rPr>
         <w:t>]</w:t>
-      </w:r>
-    </w:p>
-    <w:p>
-      <w:r>
-        <w:br w:type="page"/>
-      </w:r>
-    </w:p>
-    <w:p>
-      <w:r>
-        <w:rPr>
-          <w:b/>
-          <w:color w:val="0066CC"/>
-          <w:sz w:val="32"/>
-        </w:rPr>
-        <w:t>ESPECIFICAÇÕES TÉCNICAS E FINANCEIRAS</w:t>
-      </w:r>
-    </w:p>
-    <w:p/>
-    <w:p>
-      <w:r>
-        <w:rPr>
-          <w:b/>
-        </w:rPr>
-        <w:t>SISTEMA FOTOVOLTAICO:</w:t>
-      </w:r>
-    </w:p>
-    <w:p>
-      <w:r>
-        <w:t>• Potência: {{POTENCIA_SISTEMA}}</w:t>
-      </w:r>
-    </w:p>
-    <w:p>
-      <w:r>
-        <w:t>• Quantidade de Módulos: {{QTD_MODULOS}} unidades</w:t>
-      </w:r>
-    </w:p>
-    <w:p>
-      <w:r>
-        <w:t>• Área Necessária: {{AREA_NECESSARIA}}</w:t>
-      </w:r>
-    </w:p>
-    <w:p>
-      <w:r>
-        <w:t>• Tipo de Instalação: {{TIPO_INSTALACAO}}</w:t>
-      </w:r>
-    </w:p>
-    <w:p>
-      <w:r>
-        <w:t>• Vida Útil: {{VIDA_UTIL_SISTEMA}}</w:t>
-      </w:r>
-    </w:p>
-    <w:p/>
-    <w:p>
-      <w:r>
-        <w:rPr>
-          <w:b/>
-        </w:rPr>
-        <w:t>MÓDULOS SOLARES:</w:t>
-      </w:r>
-    </w:p>
-    <w:p>
-      <w:r>
-        <w:t>• Fabricante: {{FABRICANTE_MODULO}}</w:t>
-      </w:r>
-    </w:p>
-    <w:p>
-      <w:r>
-        <w:t>• Modelo: {{MODELO_MODULO}}</w:t>
-      </w:r>
-    </w:p>
-    <w:p>
-      <w:r>
-        <w:t>• Potência: {{POTENCIA_MODULO}}</w:t>
-      </w:r>
-    </w:p>
-    <w:p>
-      <w:r>
-        <w:t>• Garantia: {{GARANTIA_MODULOS}}</w:t>
-      </w:r>
-    </w:p>
-    <w:p/>
-    <w:p>
-      <w:r>
-        <w:rPr>
-          <w:b/>
-        </w:rPr>
-        <w:t>INVERSOR:</w:t>
-      </w:r>
-    </w:p>
-    <w:p>
-      <w:r>
-        <w:t>• Fabricante: {{FABRICANTE_INVERSOR}}</w:t>
-      </w:r>
-    </w:p>
-    <w:p>
-      <w:r>
-        <w:t>• Modelo: {{MODELO_INVERSOR}}</w:t>
-      </w:r>
-    </w:p>
-    <w:p>
-      <w:r>
-        <w:t>• Potência: {{POTENCIA_INVERSOR}}</w:t>
-      </w:r>
-    </w:p>
-    <w:p>
-      <w:r>
-        <w:t>• Garantia: {{GARANTIA_INVERSOR}}</w:t>
-      </w:r>
-    </w:p>
-    <w:p/>
-    <w:p>
-      <w:r>
-        <w:rPr>
-          <w:b/>
-        </w:rPr>
-        <w:t>GERAÇÃO E CONSUMO:</w:t>
-      </w:r>
-    </w:p>
-    <w:p>
-      <w:r>
-        <w:t>• Geração Mensal Estimada: {{GERACAO_MENSAL}}</w:t>
-      </w:r>
-    </w:p>
-    <w:p>
-      <w:r>
-        <w:t>• Geração Anual: {{GERACAO_ANUAL}}</w:t>
-      </w:r>
-    </w:p>
-    <w:p>
-      <w:r>
-        <w:t>• Consumo Mensal: {{CONSUMO_MENSAL}}</w:t>
-      </w:r>
-    </w:p>
-    <w:p>
-      <w:r>
-        <w:t>• Consumo Anual: {{CONSUMO_ANUAL}}</w:t>
-      </w:r>
-    </w:p>
-    <w:p>
-      <w:r>
-        <w:t>• Irradiação Solar: {{IRRADIACAO_SOLAR}}</w:t>
-      </w:r>
-    </w:p>
-    <w:p>
-      <w:r>
-        <w:t>• Tarifa de Energia: {{TARIFA_ENERGIA}} ({{PRECO_KWH}}/kWh)</w:t>
-      </w:r>
-    </w:p>
-    <w:p/>
-    <w:p>
-      <w:r>
-        <w:rPr>
-          <w:b/>
-        </w:rPr>
-        <w:t>ANÁLISE FINANCEIRA:</w:t>
-      </w:r>
-    </w:p>
-    <w:p>
-      <w:r>
-        <w:t>• Valor da Conta Atual: {{CONTA_LUZ_ATUAL}}/mês</w:t>
-      </w:r>
-    </w:p>
-    <w:p>
-      <w:r>
-        <w:t>• Valor da Conta Futura: {{CONTA_LUZ_FUTURA}}/mês</w:t>
-      </w:r>
-    </w:p>
-    <w:p>
-      <w:r>
-        <w:t>• Redução: {{REDUCAO_PERCENTUAL}}</w:t>
-      </w:r>
-    </w:p>
-    <w:p>
-      <w:r>
-        <w:t>• Percentual de Compensação: {{PERCENTUAL_COMPENSACAO}}</w:t>
-      </w:r>
-    </w:p>
-    <w:p/>
-    <w:p>
-      <w:r>
-        <w:rPr>
-          <w:b/>
-        </w:rPr>
-        <w:t>INVESTIMENTO:</w:t>
-      </w:r>
-    </w:p>
-    <w:p>
-      <w:r>
-        <w:t>• Equipamentos: {{CUSTO_EQUIPAMENTOS}}</w:t>
-      </w:r>
-    </w:p>
-    <w:p>
-      <w:r>
-        <w:t>• Instalação: {{CUSTO_INSTALACAO}}</w:t>
-      </w:r>
-    </w:p>
-    <w:p>
-      <w:r>
-        <w:t>• Projeto/Documentação: {{CUSTO_PROJETO}}</w:t>
-      </w:r>
-    </w:p>
-    <w:p/>
-    <w:p>
-      <w:r>
-        <w:rPr>
-          <w:b/>
-          <w:sz w:val="28"/>
-        </w:rPr>
-        <w:t>• TOTAL: {{VALOR_INVESTIMENTO}}</w:t>
-      </w:r>
-    </w:p>
-    <w:p/>
-    <w:p>
-      <w:r>
-        <w:rPr>
-          <w:b/>
-        </w:rPr>
-        <w:t>RETORNO DO INVESTIMENTO:</w:t>
-      </w:r>
-    </w:p>
-    <w:p>
-      <w:r>
-        <w:t>• Economia Mensal: {{ECONOMIA_MENSAL}}</w:t>
-      </w:r>
-    </w:p>
-    <w:p>
-      <w:r>
-        <w:t>• Economia Anual: {{ECONOMIA_ANUAL}}</w:t>
-      </w:r>
-    </w:p>
-    <w:p>
-      <w:r>
-        <w:t>• Payback (tempo de retorno): {{PAYBACK}}</w:t>
-      </w:r>
-    </w:p>
-    <w:p>
-      <w:r>
-        <w:t>• Economia em 25 anos: {{ECONOMIA_25_ANOS}}</w:t>
-      </w:r>
-    </w:p>
-    <w:p>
-      <w:r>
-        <w:t>• ROI em 25 anos: {{ROI_25_ANOS}}</w:t>
-      </w:r>
-    </w:p>
-    <w:p/>
-    <w:p>
-      <w:r>
-        <w:rPr>
-          <w:b/>
-        </w:rPr>
-        <w:t>CONDIÇÕES COMERCIAIS:</w:t>
-      </w:r>
-    </w:p>
-    <w:p>
-      <w:r>
-        <w:t>• Forma de Pagamento: {{FORMA_PAGAMENTO}}</w:t>
-      </w:r>
-    </w:p>
-    <w:p>
-      <w:r>
-        <w:t>• Prazo de Entrega: {{PRAZO_ENTREGA}}</w:t>
-      </w:r>
-    </w:p>
-    <w:p>
-      <w:r>
-        <w:t>• Prazo de Instalação: {{PRAZO_INSTALACAO}}</w:t>
-      </w:r>
-    </w:p>
-    <w:p>
-      <w:r>
-        <w:t>• Prazo Total: {{PRAZO_TOTAL}}</w:t>
-      </w:r>
-    </w:p>
-    <w:p/>
-    <w:p>
-      <w:r>
-        <w:rPr>
-          <w:b/>
-        </w:rPr>
-        <w:t>DADOS DO CLIENTE:</w:t>
-      </w:r>
-    </w:p>
-    <w:p>
-      <w:r>
-        <w:t>• Telefone: {{TELEFONE_CLIENTE}}</w:t>
-      </w:r>
-    </w:p>
-    <w:p>
-      <w:r>
-        <w:t>• E-mail: {{EMAIL_CLIENTE}}</w:t>
-      </w:r>
-    </w:p>
-    <w:p>
-      <w:r>
-        <w:t>• Endereço: {{ENDERECO_CLIENTE}}</w:t>
-      </w:r>
-    </w:p>
-    <w:p>
-      <w:r>
-        <w:t>• CEP: {{CEP_CLIENTE}}</w:t>
-      </w:r>
-    </w:p>
-    <w:p>
-      <w:r>
-        <w:t>• Cidade: {{CIDADE}} - {{ESTADO}}</w:t>
-      </w:r>
-    </w:p>
-    <w:p>
-      <w:r>
-        <w:t>• CPF/CNPJ: {{CPF_CNPJ_CLIENTE}}</w:t>
-      </w:r>
-    </w:p>
-    <w:p>
-      <w:r>
-        <w:br w:type="page"/>
-      </w:r>
-    </w:p>
-    <w:p>
-      <w:r>
-        <w:t>ANEXO - PLACEHOLDERS DISPONIVEIS</w:t>
-      </w:r>
-    </w:p>
-    <w:p>
-      <w:r>
-        <w:t>Atualizado em: 23/05/2026 15:46</w:t>
-      </w:r>
-    </w:p>
-    <w:p>
-      <w:r>
-        <w:t>Use exatamente com chaves duplas.</w:t>
-      </w:r>
-    </w:p>
-    <w:p>
-      <w:r>
-        <w:t>{{cliente_cpf_cnpj}}</w:t>
-      </w:r>
-    </w:p>
-    <w:p>
-      <w:r>
-        <w:t>{{cliente_nome}}</w:t>
-      </w:r>
-    </w:p>
-    <w:p>
-      <w:r>
-        <w:t>{{fatura_media_mensal_sem_sistema}}</w:t>
-      </w:r>
-    </w:p>
-    <w:p>
-      <w:r>
-        <w:t>{{fatura_minima}}</w:t>
-      </w:r>
-    </w:p>
-    <w:p>
-      <w:r>
-        <w:t>{{grafico_consumo_geracao_12_meses}}</w:t>
-      </w:r>
-    </w:p>
-    <w:p>
-      <w:r>
-        <w:t>{{grafico_consumo_geracao_25_anos}}</w:t>
-      </w:r>
-    </w:p>
-    <w:p>
-      <w:r>
-        <w:t>{{grafico_pay_back}}</w:t>
-      </w:r>
-    </w:p>
-    <w:p>
-      <w:r>
-        <w:t>{{id_projeto}}</w:t>
-      </w:r>
-    </w:p>
-    <w:p>
-      <w:r>
-        <w:t>{{inversor_fabricante}}</w:t>
-      </w:r>
-    </w:p>
-    <w:p>
-      <w:r>
-        <w:t>{{inversor_modelo}}</w:t>
-      </w:r>
-    </w:p>
-    <w:p>
-      <w:r>
-        <w:t>{{inversor_potencia}}</w:t>
-      </w:r>
-    </w:p>
-    <w:p>
-      <w:r>
-        <w:t>{{kit_descricao}}</w:t>
-      </w:r>
-    </w:p>
-    <w:p>
-      <w:r>
-        <w:t>{{kit_outras_inf}}</w:t>
-      </w:r>
-    </w:p>
-    <w:p>
-      <w:r>
-        <w:t>{{orcamento_valor_nota}}</w:t>
-      </w:r>
-    </w:p>
-    <w:p>
-      <w:r>
-        <w:t>{{payback_ano_lei_14300}}</w:t>
-      </w:r>
-    </w:p>
-    <w:p>
-      <w:r>
-        <w:t>{{payback_roi_lei_14300}}</w:t>
-      </w:r>
-    </w:p>
-    <w:p>
-      <w:r>
-        <w:t>{{placa_fabricante}}</w:t>
-      </w:r>
-    </w:p>
-    <w:p>
-      <w:r>
-        <w:t>{{placa_modelo}}</w:t>
-      </w:r>
-    </w:p>
-    <w:p>
-      <w:r>
-        <w:t>{{placa_potencia}}</w:t>
-      </w:r>
-    </w:p>
-    <w:p>
-      <w:r>
-        <w:t>{{preco_kwh}}</w:t>
-      </w:r>
-    </w:p>
-    <w:p>
-      <w:r>
-        <w:t>{{qtd_inversores}}</w:t>
-      </w:r>
-    </w:p>
-    <w:p>
-      <w:r>
-        <w:t>{{qtd_placas}}</w:t>
-      </w:r>
-    </w:p>
-    <w:p>
-      <w:r>
-        <w:t>{{reajuste_anual}}</w:t>
-      </w:r>
-    </w:p>
-    <w:p>
-      <w:r>
-        <w:t>{{tabela_12_meses}}</w:t>
-      </w:r>
-    </w:p>
-    <w:p>
-      <w:r>
-        <w:t>{{tabela_25_anos}}</w:t>
       </w:r>
     </w:p>
     <w:sectPr>
@@ -7435,15 +6968,15 @@
                         <a:noFill/>
                       </a:ln>
                       <a:extLst>
-                        <a:ext uri="{909E8E84-426E-40DD-AFC4-6F175D3DCCD1}">
-                          <a14:hiddenFill xmlns:a14="http://schemas.microsoft.com/office/drawing/2010/main">
+                        <a:ext uri="[909E8E84-426E-40DD-AFC4-6F175D3DCCD1]">
+                          <a14:hiddenFill xmlns="" xmlns:o="urn:schemas-microsoft-com:office:office" xmlns:v="urn:schemas-microsoft-com:vml" xmlns:w10="urn:schemas-microsoft-com:office:word" xmlns:w="http://schemas.openxmlformats.org/wordprocessingml/2006/main" xmlns:a14="http://schemas.microsoft.com/office/drawing/2010/main">
                             <a:solidFill>
                               <a:srgbClr val="FFFFFF"/>
                             </a:solidFill>
                           </a14:hiddenFill>
                         </a:ext>
-                        <a:ext uri="{91240B29-F687-4F45-9708-019B960494DF}">
-                          <a14:hiddenLine xmlns:a14="http://schemas.microsoft.com/office/drawing/2010/main" w="9525">
+                        <a:ext uri="[91240B29-F687-4F45-9708-019B960494DF]">
+                          <a14:hiddenLine xmlns="" xmlns:o="urn:schemas-microsoft-com:office:office" xmlns:v="urn:schemas-microsoft-com:vml" xmlns:w10="urn:schemas-microsoft-com:office:word" xmlns:w="http://schemas.openxmlformats.org/wordprocessingml/2006/main" xmlns:a14="http://schemas.microsoft.com/office/drawing/2010/main" w="9525">
                             <a:solidFill>
                               <a:srgbClr val="000000"/>
                             </a:solidFill>
@@ -8211,15 +7744,15 @@
                         <a:noFill/>
                       </a:ln>
                       <a:extLst>
-                        <a:ext uri="{909E8E84-426E-40DD-AFC4-6F175D3DCCD1}">
-                          <a14:hiddenFill xmlns:a14="http://schemas.microsoft.com/office/drawing/2010/main">
+                        <a:ext uri="[909E8E84-426E-40DD-AFC4-6F175D3DCCD1]">
+                          <a14:hiddenFill xmlns="" xmlns:o="urn:schemas-microsoft-com:office:office" xmlns:v="urn:schemas-microsoft-com:vml" xmlns:w10="urn:schemas-microsoft-com:office:word" xmlns:w="http://schemas.openxmlformats.org/wordprocessingml/2006/main" xmlns:a14="http://schemas.microsoft.com/office/drawing/2010/main">
                             <a:solidFill>
                               <a:srgbClr val="FFFFFF"/>
                             </a:solidFill>
                           </a14:hiddenFill>
                         </a:ext>
-                        <a:ext uri="{91240B29-F687-4F45-9708-019B960494DF}">
-                          <a14:hiddenLine xmlns:a14="http://schemas.microsoft.com/office/drawing/2010/main" w="9525">
+                        <a:ext uri="[91240B29-F687-4F45-9708-019B960494DF]">
+                          <a14:hiddenLine xmlns="" xmlns:o="urn:schemas-microsoft-com:office:office" xmlns:v="urn:schemas-microsoft-com:vml" xmlns:w10="urn:schemas-microsoft-com:office:word" xmlns:w="http://schemas.openxmlformats.org/wordprocessingml/2006/main" xmlns:a14="http://schemas.microsoft.com/office/drawing/2010/main" w="9525">
                             <a:solidFill>
                               <a:srgbClr val="000000"/>
                             </a:solidFill>
@@ -8962,13 +8495,13 @@
         <w:szCs w:val="20"/>
       </w:rPr>
       <w:drawing>
-        <wp:anchor distT="0" distB="0" distL="114300" distR="114300" simplePos="0" relativeHeight="251683840" behindDoc="0" locked="0" layoutInCell="1" allowOverlap="1" wp14:anchorId="0A4A19A7" wp14:editId="488E27E0">
+        <wp:anchor distT="0" distB="0" distL="114300" distR="114300" simplePos="0" relativeHeight="251683840" behindDoc="0" locked="0" layoutInCell="1" allowOverlap="1" wp14:anchorId="0A4A19A7" wp14:editId="10778FAA">
           <wp:simplePos x="0" y="0"/>
           <wp:positionH relativeFrom="column">
-            <wp:posOffset>1249680</wp:posOffset>
+            <wp:posOffset>1250315</wp:posOffset>
           </wp:positionH>
           <wp:positionV relativeFrom="paragraph">
-            <wp:posOffset>-89535</wp:posOffset>
+            <wp:posOffset>-88900</wp:posOffset>
           </wp:positionV>
           <wp:extent cx="600075" cy="600075"/>
           <wp:effectExtent l="0" t="0" r="9525" b="9525"/>
@@ -9022,13 +8555,13 @@
         <w:noProof/>
       </w:rPr>
       <w:drawing>
-        <wp:anchor distT="0" distB="0" distL="114300" distR="114300" simplePos="0" relativeHeight="251664384" behindDoc="1" locked="0" layoutInCell="1" allowOverlap="1" wp14:anchorId="43FE9406" wp14:editId="103160E1">
+        <wp:anchor distT="0" distB="0" distL="114300" distR="114300" simplePos="0" relativeHeight="251664384" behindDoc="1" locked="0" layoutInCell="1" allowOverlap="1" wp14:anchorId="43FE9406" wp14:editId="7AB1C24A">
           <wp:simplePos x="0" y="0"/>
           <wp:positionH relativeFrom="page">
-            <wp:align>right</wp:align>
+            <wp:posOffset>12700</wp:posOffset>
           </wp:positionH>
           <wp:positionV relativeFrom="paragraph">
-            <wp:posOffset>-267817</wp:posOffset>
+            <wp:posOffset>-264725</wp:posOffset>
           </wp:positionV>
           <wp:extent cx="7548109" cy="10672445"/>
           <wp:effectExtent l="0" t="0" r="0" b="0"/>
@@ -9049,8 +8582,8 @@
                 <pic:blipFill>
                   <a:blip r:embed="rId2">
                     <a:extLst>
-                      <a:ext uri="{28A0092B-C50C-407E-A947-70E740481C1C}">
-                        <a14:useLocalDpi xmlns:a14="http://schemas.microsoft.com/office/drawing/2010/main" val="0"/>
+                      <a:ext uri="[28A0092B-C50C-407E-A947-70E740481C1C]">
+                        <a14:useLocalDpi xmlns="" xmlns:o="urn:schemas-microsoft-com:office:office" xmlns:v="urn:schemas-microsoft-com:vml" xmlns:w10="urn:schemas-microsoft-com:office:word" xmlns:w="http://schemas.openxmlformats.org/wordprocessingml/2006/main" xmlns:a14="http://schemas.microsoft.com/office/drawing/2010/main" val="0"/>
                       </a:ext>
                     </a:extLst>
                   </a:blip>
@@ -9062,7 +8595,7 @@
                 <pic:spPr bwMode="auto">
                   <a:xfrm>
                     <a:off x="0" y="0"/>
-                    <a:ext cx="7551409" cy="10677111"/>
+                    <a:ext cx="7548109" cy="10672445"/>
                   </a:xfrm>
                   <a:prstGeom prst="rect">
                     <a:avLst/>
@@ -9133,10 +8666,6 @@
     <w:pPr>
       <w:spacing w:after="0"/>
       <w:ind w:right="-24"/>
-      <w:rPr>
-        <w:rFonts w:cs="Times New Roman"/>
-        <w:szCs w:val="20"/>
-      </w:rPr>
     </w:pPr>
     <w:r>
       <w:rPr>
@@ -9150,42 +8679,8 @@
         <w:rFonts w:cs="Times New Roman"/>
         <w:szCs w:val="20"/>
       </w:rPr>
-      <w:fldChar w:fldCharType="begin"/>
+      <w:t>[DATA_PROPOSTA]</w:t>
     </w:r>
-    <w:r>
-      <w:rPr>
-        <w:rFonts w:cs="Times New Roman"/>
-        <w:szCs w:val="20"/>
-      </w:rPr>
-      <w:instrText xml:space="preserve"> TIME \@ "dd/MM/yy" </w:instrText>
-    </w:r>
-    <w:r>
-      <w:rPr>
-        <w:rFonts w:cs="Times New Roman"/>
-        <w:szCs w:val="20"/>
-      </w:rPr>
-      <w:fldChar w:fldCharType="separate"/>
-    </w:r>
-    <w:r>
-      <w:rPr>
-        <w:rFonts w:cs="Times New Roman"/>
-        <w:noProof/>
-        <w:szCs w:val="20"/>
-      </w:rPr>
-      <w:t>23/05/26</w:t>
-    </w:r>
-    <w:r>
-      <w:rPr>
-        <w:rFonts w:cs="Times New Roman"/>
-        <w:szCs w:val="20"/>
-      </w:rPr>
-      <w:fldChar w:fldCharType="end"/>
-    </w:r>
-  </w:p>
-  <w:p>
-    <w:pPr>
-      <w:pStyle w:val="Cabealho"/>
-    </w:pPr>
   </w:p>
 </w:hdr>
 </file>
@@ -9228,8 +8723,8 @@
                 <pic:blipFill>
                   <a:blip r:embed="rId1">
                     <a:extLst>
-                      <a:ext uri="{28A0092B-C50C-407E-A947-70E740481C1C}">
-                        <a14:useLocalDpi xmlns:a14="http://schemas.microsoft.com/office/drawing/2010/main" val="0"/>
+                      <a:ext uri="[28A0092B-C50C-407E-A947-70E740481C1C]">
+                        <a14:useLocalDpi xmlns="" xmlns:o="urn:schemas-microsoft-com:office:office" xmlns:v="urn:schemas-microsoft-com:vml" xmlns:w10="urn:schemas-microsoft-com:office:word" xmlns:w="http://schemas.openxmlformats.org/wordprocessingml/2006/main" xmlns:a14="http://schemas.microsoft.com/office/drawing/2010/main" val="0"/>
                       </a:ext>
                     </a:extLst>
                   </a:blip>
@@ -9318,8 +8813,8 @@
                 <pic:blipFill>
                   <a:blip r:embed="rId1">
                     <a:extLst>
-                      <a:ext uri="{28A0092B-C50C-407E-A947-70E740481C1C}">
-                        <a14:useLocalDpi xmlns:a14="http://schemas.microsoft.com/office/drawing/2010/main" val="0"/>
+                      <a:ext uri="[28A0092B-C50C-407E-A947-70E740481C1C]">
+                        <a14:useLocalDpi xmlns="" xmlns:o="urn:schemas-microsoft-com:office:office" xmlns:v="urn:schemas-microsoft-com:vml" xmlns:w10="urn:schemas-microsoft-com:office:word" xmlns:w="http://schemas.openxmlformats.org/wordprocessingml/2006/main" xmlns:a14="http://schemas.microsoft.com/office/drawing/2010/main" val="0"/>
                       </a:ext>
                     </a:extLst>
                   </a:blip>
@@ -9354,7 +8849,7 @@
       <w:rPr>
         <w:noProof/>
       </w:rPr>
-      <w:t>{NUMERO_PROJETO}}</w:t>
+      <w:t>[NUMERO_PROJETO]</w:t>
     </w:r>
     <w:r>
       <w:rPr>
@@ -9388,8 +8883,8 @@
                 <pic:blipFill>
                   <a:blip r:embed="rId2">
                     <a:extLst>
-                      <a:ext uri="{28A0092B-C50C-407E-A947-70E740481C1C}">
-                        <a14:useLocalDpi xmlns:a14="http://schemas.microsoft.com/office/drawing/2010/main" val="0"/>
+                      <a:ext uri="[28A0092B-C50C-407E-A947-70E740481C1C]">
+                        <a14:useLocalDpi xmlns="" xmlns:o="urn:schemas-microsoft-com:office:office" xmlns:v="urn:schemas-microsoft-com:vml" xmlns:w10="urn:schemas-microsoft-com:office:word" xmlns:w="http://schemas.openxmlformats.org/wordprocessingml/2006/main" xmlns:a14="http://schemas.microsoft.com/office/drawing/2010/main" val="0"/>
                       </a:ext>
                     </a:extLst>
                   </a:blip>
@@ -9451,7 +8946,7 @@
         <w:rFonts w:cs="Times New Roman"/>
         <w:szCs w:val="20"/>
       </w:rPr>
-      <w:t>{{DATA_PROPOSTA}}</w:t>
+      <w:t>[DATA_PROPOSTA]</w:t>
     </w:r>
   </w:p>
   <w:p>
@@ -9493,14 +8988,14 @@
         <v:path o:extrusionok="f" gradientshapeok="t" o:connecttype="rect"/>
         <o:lock v:ext="edit" aspectratio="t"/>
       </v:shapetype>
-      <v:shape id="_x0000_i1132" type="#_x0000_t75" style="width:21.75pt;height:20.25pt;visibility:visible;mso-wrap-style:square" o:bullet="t">
+      <v:shape id="_x0000_i1056" type="#_x0000_t75" style="width:21.75pt;height:20.25pt;visibility:visible;mso-wrap-style:square" o:bullet="t">
         <v:imagedata r:id="rId1" o:title=""/>
       </v:shape>
     </w:pict>
   </w:numPicBullet>
   <w:numPicBullet w:numPicBulletId="1">
     <w:pict>
-      <v:shape id="_x0000_i1133" type="#_x0000_t75" style="width:21pt;height:19.5pt;visibility:visible;mso-wrap-style:square" o:bullet="t">
+      <v:shape id="_x0000_i1057" type="#_x0000_t75" style="width:21pt;height:19.5pt;visibility:visible;mso-wrap-style:square" o:bullet="t">
         <v:imagedata r:id="rId2" o:title=""/>
       </v:shape>
     </w:pict>
@@ -10670,6 +10165,7 @@
   <w:style w:type="character" w:default="1" w:styleId="Fontepargpadro">
     <w:name w:val="Default Paragraph Font"/>
     <w:uiPriority w:val="1"/>
+    <w:semiHidden/>
     <w:unhideWhenUsed/>
   </w:style>
   <w:style w:type="table" w:default="1" w:styleId="Tabelanormal">
@@ -11506,8 +11002,8 @@
   <a:objectDefaults/>
   <a:extraClrSchemeLst/>
   <a:extLst>
-    <a:ext uri="{05A4C25C-085E-4340-85A3-A5531E510DB2}">
-      <thm15:themeFamily xmlns:thm15="http://schemas.microsoft.com/office/thememl/2012/main" name="Office Theme" id="{62F939B6-93AF-4DB8-9C6B-D6C7DFDC589F}" vid="{4A3C46E8-61CC-4603-A589-7422A47A8E4A}"/>
+    <a:ext uri="[05A4C25C-085E-4340-85A3-A5531E510DB2]">
+      <thm15:themeFamily xmlns="" xmlns:thm15="http://schemas.microsoft.com/office/thememl/2012/main" name="Office Theme" id="[62F939B6-93AF-4DB8-9C6B-D6C7DFDC589F]" vid="[4A3C46E8-61CC-4603-A589-7422A47A8E4A]"/>
     </a:ext>
   </a:extLst>
 </a:theme>

</xml_diff>